<commit_message>
PA1 : add imagination
</commit_message>
<xml_diff>
--- a/instructions/PA1/RTOS_M11407509_PA1.docx
+++ b/instructions/PA1/RTOS_M11407509_PA1.docx
@@ -87,7 +87,7 @@
       <w:pPr>
         <w:jc w:val="center"/>
         <w:rPr>
-          <w:rFonts w:ascii="Times New Roman" w:eastAsia="標楷體" w:hAnsi="Times New Roman" w:cs="Times New Roman" w:hint="eastAsia"/>
+          <w:rFonts w:ascii="Times New Roman" w:eastAsia="標楷體" w:hAnsi="Times New Roman" w:cs="Times New Roman"/>
           <w:noProof/>
           <w:kern w:val="0"/>
           <w:sz w:val="24"/>
@@ -1012,7 +1012,7 @@
       <w:pPr>
         <w:jc w:val="both"/>
         <w:rPr>
-          <w:rFonts w:ascii="標楷體" w:eastAsia="標楷體" w:hAnsi="標楷體" w:cs="新細明體" w:hint="eastAsia"/>
+          <w:rFonts w:ascii="標楷體" w:eastAsia="標楷體" w:hAnsi="標楷體" w:cs="新細明體"/>
           <w:kern w:val="0"/>
           <w:sz w:val="24"/>
           <w:szCs w:val="24"/>

</xml_diff>